<commit_message>
Cambio en diagrama de clases, se completo el codigo faltante, solamente faltan diagramas de secuencia
</commit_message>
<xml_diff>
--- a/AVANCE.docx
+++ b/AVANCE.docx
@@ -1,49 +1,39 @@
 
 <file path=word/document.xml><?xml version="1.0" encoding="utf-8"?>
-<w:document xmlns:wpc="http://schemas.microsoft.com/office/word/2010/wordprocessingCanvas" xmlns:cx="http://schemas.microsoft.com/office/drawing/2014/chartex" xmlns:mc="http://schemas.openxmlformats.org/markup-compatibility/2006" xmlns:o="urn:schemas-microsoft-com:office:office" xmlns:r="http://schemas.openxmlformats.org/officeDocument/2006/relationships" xmlns:m="http://schemas.openxmlformats.org/officeDocument/2006/math" xmlns:v="urn:schemas-microsoft-com:vml" xmlns:wp14="http://schemas.microsoft.com/office/word/2010/wordprocessingDrawing" xmlns:wp="http://schemas.openxmlformats.org/drawingml/2006/wordprocessingDrawing" xmlns:w10="urn:schemas-microsoft-com:office:word" xmlns:w="http://schemas.openxmlformats.org/wordprocessingml/2006/main" xmlns:w14="http://schemas.microsoft.com/office/word/2010/wordml" xmlns:w15="http://schemas.microsoft.com/office/word/2012/wordml" xmlns:w16se="http://schemas.microsoft.com/office/word/2015/wordml/symex" xmlns:wpg="http://schemas.microsoft.com/office/word/2010/wordprocessingGroup" xmlns:wpi="http://schemas.microsoft.com/office/word/2010/wordprocessingInk" xmlns:wne="http://schemas.microsoft.com/office/word/2006/wordml" xmlns:wps="http://schemas.microsoft.com/office/word/2010/wordprocessingShape" mc:Ignorable="w14 w15 w16se wp14">
+<w:document xmlns:wpc="http://schemas.microsoft.com/office/word/2010/wordprocessingCanvas" xmlns:cx="http://schemas.microsoft.com/office/drawing/2014/chartex" xmlns:cx1="http://schemas.microsoft.com/office/drawing/2015/9/8/chartex" xmlns:cx2="http://schemas.microsoft.com/office/drawing/2015/10/21/chartex" xmlns:cx3="http://schemas.microsoft.com/office/drawing/2016/5/9/chartex" xmlns:cx4="http://schemas.microsoft.com/office/drawing/2016/5/10/chartex" xmlns:cx5="http://schemas.microsoft.com/office/drawing/2016/5/11/chartex" xmlns:cx6="http://schemas.microsoft.com/office/drawing/2016/5/12/chartex" xmlns:cx7="http://schemas.microsoft.com/office/drawing/2016/5/13/chartex" xmlns:cx8="http://schemas.microsoft.com/office/drawing/2016/5/14/chartex" xmlns:mc="http://schemas.openxmlformats.org/markup-compatibility/2006" xmlns:aink="http://schemas.microsoft.com/office/drawing/2016/ink" xmlns:am3d="http://schemas.microsoft.com/office/drawing/2017/model3d" xmlns:o="urn:schemas-microsoft-com:office:office" xmlns:oel="http://schemas.microsoft.com/office/2019/extlst" xmlns:r="http://schemas.openxmlformats.org/officeDocument/2006/relationships" xmlns:m="http://schemas.openxmlformats.org/officeDocument/2006/math" xmlns:v="urn:schemas-microsoft-com:vml" xmlns:wp14="http://schemas.microsoft.com/office/word/2010/wordprocessingDrawing" xmlns:wp="http://schemas.openxmlformats.org/drawingml/2006/wordprocessingDrawing" xmlns:w10="urn:schemas-microsoft-com:office:word" xmlns:w="http://schemas.openxmlformats.org/wordprocessingml/2006/main" xmlns:w14="http://schemas.microsoft.com/office/word/2010/wordml" xmlns:w15="http://schemas.microsoft.com/office/word/2012/wordml" xmlns:w16cex="http://schemas.microsoft.com/office/word/2018/wordml/cex" xmlns:w16cid="http://schemas.microsoft.com/office/word/2016/wordml/cid" xmlns:w16="http://schemas.microsoft.com/office/word/2018/wordml" xmlns:w16du="http://schemas.microsoft.com/office/word/2023/wordml/word16du" xmlns:w16sdtdh="http://schemas.microsoft.com/office/word/2020/wordml/sdtdatahash" xmlns:w16sdtfl="http://schemas.microsoft.com/office/word/2024/wordml/sdtformatlock" xmlns:w16se="http://schemas.microsoft.com/office/word/2015/wordml/symex" xmlns:wpg="http://schemas.microsoft.com/office/word/2010/wordprocessingGroup" xmlns:wpi="http://schemas.microsoft.com/office/word/2010/wordprocessingInk" xmlns:wne="http://schemas.microsoft.com/office/word/2006/wordml" xmlns:wps="http://schemas.microsoft.com/office/word/2010/wordprocessingShape" mc:Ignorable="w14 w15 w16se w16cid w16 w16cex w16sdtdh w16sdtfl w16du wp14">
   <w:body>
     <w:p>
       <w:pPr>
-        <w:jc w:val="center"/>
-        <w:rPr>
-          <w:b/>
-        </w:rPr>
-      </w:pPr>
-      <w:r>
-        <w:rPr>
-          <w:b/>
-        </w:rPr>
-        <w:t>AVANCE</w:t>
-      </w:r>
-    </w:p>
-    <w:p>
-      <w:pPr>
-        <w:jc w:val="center"/>
-        <w:rPr>
-          <w:b/>
-        </w:rPr>
-      </w:pPr>
-      <w:r>
-        <w:rPr>
-          <w:b/>
+        <w:rPr>
+          <w:rFonts w:ascii="Arial" w:hAnsi="Arial" w:cs="Arial"/>
+          <w:b/>
+          <w:sz w:val="24"/>
+          <w:szCs w:val="24"/>
+        </w:rPr>
+      </w:pPr>
+      <w:r>
+        <w:rPr>
+          <w:rFonts w:ascii="Times New Roman"/>
+          <w:noProof/>
+          <w:sz w:val="20"/>
         </w:rPr>
         <w:drawing>
-          <wp:inline distT="0" distB="0" distL="0" distR="0" wp14:anchorId="3CB38C27" wp14:editId="6287A5EF">
-            <wp:extent cx="5612130" cy="3015615"/>
-            <wp:effectExtent l="0" t="0" r="7620" b="0"/>
-            <wp:docPr id="1" name="Imagen 1"/>
+          <wp:inline distT="0" distB="0" distL="0" distR="0" wp14:anchorId="1FA79415" wp14:editId="7AE8ACB0">
+            <wp:extent cx="1457325" cy="828675"/>
+            <wp:effectExtent l="0" t="0" r="0" b="0"/>
+            <wp:docPr id="1" name="Image 1"/>
             <wp:cNvGraphicFramePr>
-              <a:graphicFrameLocks xmlns:a="http://schemas.openxmlformats.org/drawingml/2006/main" noChangeAspect="1"/>
+              <a:graphicFrameLocks xmlns:a="http://schemas.openxmlformats.org/drawingml/2006/main"/>
             </wp:cNvGraphicFramePr>
             <a:graphic xmlns:a="http://schemas.openxmlformats.org/drawingml/2006/main">
               <a:graphicData uri="http://schemas.openxmlformats.org/drawingml/2006/picture">
                 <pic:pic xmlns:pic="http://schemas.openxmlformats.org/drawingml/2006/picture">
                   <pic:nvPicPr>
-                    <pic:cNvPr id="1" name=""/>
+                    <pic:cNvPr id="1" name="Image 1"/>
                     <pic:cNvPicPr/>
                   </pic:nvPicPr>
                   <pic:blipFill>
-                    <a:blip r:embed="rId4"/>
+                    <a:blip r:embed="rId5" cstate="print"/>
                     <a:stretch>
                       <a:fillRect/>
                     </a:stretch>
@@ -51,7 +41,7 @@
                   <pic:spPr>
                     <a:xfrm>
                       <a:off x="0" y="0"/>
-                      <a:ext cx="5612130" cy="3015615"/>
+                      <a:ext cx="1457325" cy="828675"/>
                     </a:xfrm>
                     <a:prstGeom prst="rect">
                       <a:avLst/>
@@ -68,18 +58,856 @@
       <w:pPr>
         <w:jc w:val="center"/>
         <w:rPr>
-          <w:b/>
-        </w:rPr>
-      </w:pPr>
-      <w:r>
-        <w:rPr>
-          <w:b/>
+          <w:rFonts w:ascii="Arial" w:hAnsi="Arial" w:cs="Arial"/>
+          <w:b/>
+          <w:sz w:val="24"/>
+          <w:szCs w:val="24"/>
+        </w:rPr>
+      </w:pPr>
+    </w:p>
+    <w:p>
+      <w:pPr>
+        <w:jc w:val="center"/>
+        <w:rPr>
+          <w:rFonts w:ascii="Arial" w:hAnsi="Arial" w:cs="Arial"/>
+          <w:b/>
+          <w:sz w:val="24"/>
+          <w:szCs w:val="24"/>
+        </w:rPr>
+      </w:pPr>
+    </w:p>
+    <w:p>
+      <w:pPr>
+        <w:jc w:val="center"/>
+        <w:rPr>
+          <w:rFonts w:ascii="Arial" w:hAnsi="Arial" w:cs="Arial"/>
+          <w:b/>
+          <w:sz w:val="24"/>
+          <w:szCs w:val="24"/>
+        </w:rPr>
+      </w:pPr>
+      <w:r>
+        <w:rPr>
+          <w:rFonts w:ascii="Arial" w:hAnsi="Arial" w:cs="Arial"/>
+          <w:b/>
+          <w:sz w:val="24"/>
+          <w:szCs w:val="24"/>
+        </w:rPr>
+        <w:t>Universidad Escuela Colombiana De Ingeniería Julio Garavito</w:t>
+      </w:r>
+    </w:p>
+    <w:p>
+      <w:pPr>
+        <w:jc w:val="center"/>
+        <w:rPr>
+          <w:rFonts w:ascii="Arial" w:hAnsi="Arial" w:cs="Arial"/>
+          <w:b/>
+          <w:sz w:val="24"/>
+          <w:szCs w:val="24"/>
+        </w:rPr>
+      </w:pPr>
+    </w:p>
+    <w:p>
+      <w:pPr>
+        <w:jc w:val="center"/>
+        <w:rPr>
+          <w:rFonts w:ascii="Arial" w:hAnsi="Arial" w:cs="Arial"/>
+          <w:b/>
+          <w:spacing w:val="-2"/>
+          <w:sz w:val="24"/>
+          <w:szCs w:val="24"/>
+        </w:rPr>
+      </w:pPr>
+      <w:r>
+        <w:rPr>
+          <w:rFonts w:ascii="Arial" w:hAnsi="Arial" w:cs="Arial"/>
+          <w:b/>
+          <w:spacing w:val="-2"/>
+          <w:sz w:val="24"/>
+          <w:szCs w:val="24"/>
+        </w:rPr>
+        <w:t>Taller</w:t>
+      </w:r>
+    </w:p>
+    <w:p>
+      <w:pPr>
+        <w:jc w:val="center"/>
+        <w:rPr>
+          <w:rFonts w:ascii="Arial" w:hAnsi="Arial" w:cs="Arial"/>
+          <w:b/>
+          <w:sz w:val="24"/>
+          <w:szCs w:val="24"/>
+        </w:rPr>
+      </w:pPr>
+      <w:r>
+        <w:rPr>
+          <w:rFonts w:ascii="Arial" w:hAnsi="Arial" w:cs="Arial"/>
+          <w:b/>
+          <w:sz w:val="24"/>
+          <w:szCs w:val="24"/>
+        </w:rPr>
+        <w:t>SEMANA 08</w:t>
+      </w:r>
+    </w:p>
+    <w:p>
+      <w:pPr>
+        <w:jc w:val="center"/>
+        <w:rPr>
+          <w:rFonts w:ascii="Arial" w:hAnsi="Arial" w:cs="Arial"/>
+          <w:b/>
+          <w:sz w:val="24"/>
+          <w:szCs w:val="24"/>
+        </w:rPr>
+      </w:pPr>
+    </w:p>
+    <w:p>
+      <w:pPr>
+        <w:jc w:val="center"/>
+        <w:rPr>
+          <w:rFonts w:ascii="Arial" w:hAnsi="Arial" w:cs="Arial"/>
+          <w:b/>
+          <w:sz w:val="24"/>
+          <w:szCs w:val="24"/>
+        </w:rPr>
+      </w:pPr>
+    </w:p>
+    <w:p>
+      <w:pPr>
+        <w:jc w:val="center"/>
+        <w:rPr>
+          <w:rFonts w:ascii="Arial" w:hAnsi="Arial" w:cs="Arial"/>
+          <w:b/>
+          <w:sz w:val="24"/>
+          <w:szCs w:val="24"/>
+        </w:rPr>
+      </w:pPr>
+      <w:r>
+        <w:rPr>
+          <w:rFonts w:ascii="Arial" w:hAnsi="Arial" w:cs="Arial"/>
+          <w:b/>
+          <w:sz w:val="24"/>
+          <w:szCs w:val="24"/>
+        </w:rPr>
+        <w:t>ESTUDIANTES</w:t>
+      </w:r>
+    </w:p>
+    <w:p>
+      <w:pPr>
+        <w:jc w:val="center"/>
+        <w:rPr>
+          <w:rFonts w:ascii="Arial" w:hAnsi="Arial" w:cs="Arial"/>
+          <w:b/>
+          <w:sz w:val="24"/>
+          <w:szCs w:val="24"/>
+        </w:rPr>
+      </w:pPr>
+    </w:p>
+    <w:p>
+      <w:pPr>
+        <w:jc w:val="center"/>
+        <w:rPr>
+          <w:rFonts w:ascii="Arial" w:hAnsi="Arial" w:cs="Arial"/>
+          <w:b/>
+          <w:sz w:val="24"/>
+          <w:szCs w:val="24"/>
+        </w:rPr>
+      </w:pPr>
+    </w:p>
+    <w:p>
+      <w:pPr>
+        <w:jc w:val="center"/>
+        <w:rPr>
+          <w:rFonts w:ascii="Arial" w:hAnsi="Arial" w:cs="Arial"/>
+          <w:bCs/>
+          <w:sz w:val="24"/>
+          <w:szCs w:val="24"/>
+        </w:rPr>
+      </w:pPr>
+      <w:r>
+        <w:rPr>
+          <w:rFonts w:ascii="Arial" w:hAnsi="Arial" w:cs="Arial"/>
+          <w:bCs/>
+          <w:sz w:val="24"/>
+          <w:szCs w:val="24"/>
+        </w:rPr>
+        <w:t xml:space="preserve">Juan </w:t>
+      </w:r>
+      <w:proofErr w:type="spellStart"/>
+      <w:r>
+        <w:rPr>
+          <w:rFonts w:ascii="Arial" w:hAnsi="Arial" w:cs="Arial"/>
+          <w:bCs/>
+          <w:sz w:val="24"/>
+          <w:szCs w:val="24"/>
+        </w:rPr>
+        <w:t>Sebastian</w:t>
+      </w:r>
+      <w:proofErr w:type="spellEnd"/>
+      <w:r>
+        <w:rPr>
+          <w:rFonts w:ascii="Arial" w:hAnsi="Arial" w:cs="Arial"/>
+          <w:bCs/>
+          <w:sz w:val="24"/>
+          <w:szCs w:val="24"/>
+        </w:rPr>
+        <w:t xml:space="preserve"> Nieto Herrera</w:t>
+      </w:r>
+    </w:p>
+    <w:p>
+      <w:pPr>
+        <w:jc w:val="center"/>
+        <w:rPr>
+          <w:rFonts w:ascii="Arial" w:hAnsi="Arial" w:cs="Arial"/>
+          <w:bCs/>
+          <w:sz w:val="24"/>
+          <w:szCs w:val="24"/>
+        </w:rPr>
+      </w:pPr>
+      <w:r>
+        <w:rPr>
+          <w:rFonts w:ascii="Arial" w:hAnsi="Arial" w:cs="Arial"/>
+          <w:bCs/>
+          <w:sz w:val="24"/>
+          <w:szCs w:val="24"/>
+        </w:rPr>
+        <w:t>Daniel Valero Quiroga</w:t>
+      </w:r>
+    </w:p>
+    <w:p>
+      <w:pPr>
+        <w:jc w:val="center"/>
+        <w:rPr>
+          <w:rFonts w:ascii="Arial" w:hAnsi="Arial" w:cs="Arial"/>
+          <w:b/>
+          <w:sz w:val="24"/>
+          <w:szCs w:val="24"/>
+        </w:rPr>
+      </w:pPr>
+    </w:p>
+    <w:p>
+      <w:pPr>
+        <w:jc w:val="center"/>
+        <w:rPr>
+          <w:rFonts w:ascii="Arial" w:hAnsi="Arial" w:cs="Arial"/>
+          <w:b/>
+          <w:sz w:val="24"/>
+          <w:szCs w:val="24"/>
+        </w:rPr>
+      </w:pPr>
+      <w:r>
+        <w:rPr>
+          <w:rFonts w:ascii="Arial" w:hAnsi="Arial" w:cs="Arial"/>
+          <w:b/>
+          <w:sz w:val="24"/>
+          <w:szCs w:val="24"/>
+        </w:rPr>
+        <w:t>Asignatura</w:t>
+      </w:r>
+    </w:p>
+    <w:p>
+      <w:pPr>
+        <w:jc w:val="center"/>
+        <w:rPr>
+          <w:rFonts w:ascii="Arial" w:hAnsi="Arial" w:cs="Arial"/>
+          <w:bCs/>
+          <w:sz w:val="24"/>
+          <w:szCs w:val="24"/>
+        </w:rPr>
+      </w:pPr>
+      <w:r>
+        <w:rPr>
+          <w:rFonts w:ascii="Arial" w:hAnsi="Arial" w:cs="Arial"/>
+          <w:bCs/>
+          <w:sz w:val="24"/>
+          <w:szCs w:val="24"/>
+        </w:rPr>
+        <w:t xml:space="preserve">Desarrollo </w:t>
+      </w:r>
+      <w:proofErr w:type="spellStart"/>
+      <w:r>
+        <w:rPr>
+          <w:rFonts w:ascii="Arial" w:hAnsi="Arial" w:cs="Arial"/>
+          <w:bCs/>
+          <w:sz w:val="24"/>
+          <w:szCs w:val="24"/>
+        </w:rPr>
+        <w:t>Oriantado</w:t>
+      </w:r>
+      <w:proofErr w:type="spellEnd"/>
+      <w:r>
+        <w:rPr>
+          <w:rFonts w:ascii="Arial" w:hAnsi="Arial" w:cs="Arial"/>
+          <w:bCs/>
+          <w:sz w:val="24"/>
+          <w:szCs w:val="24"/>
+        </w:rPr>
+        <w:t xml:space="preserve"> a Objetos</w:t>
+      </w:r>
+    </w:p>
+    <w:p>
+      <w:pPr>
+        <w:jc w:val="center"/>
+        <w:rPr>
+          <w:rFonts w:ascii="Arial" w:hAnsi="Arial" w:cs="Arial"/>
+          <w:b/>
+          <w:sz w:val="24"/>
+          <w:szCs w:val="24"/>
+        </w:rPr>
+      </w:pPr>
+    </w:p>
+    <w:p>
+      <w:pPr>
+        <w:jc w:val="center"/>
+        <w:rPr>
+          <w:rFonts w:ascii="Arial" w:hAnsi="Arial" w:cs="Arial"/>
+          <w:b/>
+          <w:sz w:val="24"/>
+          <w:szCs w:val="24"/>
+        </w:rPr>
+      </w:pPr>
+      <w:r>
+        <w:rPr>
+          <w:rFonts w:ascii="Arial" w:hAnsi="Arial" w:cs="Arial"/>
+          <w:b/>
+          <w:sz w:val="24"/>
+          <w:szCs w:val="24"/>
+        </w:rPr>
+        <w:t>Profe</w:t>
+      </w:r>
+      <w:r>
+        <w:rPr>
+          <w:rFonts w:ascii="Arial" w:hAnsi="Arial" w:cs="Arial"/>
+          <w:b/>
+          <w:sz w:val="24"/>
+          <w:szCs w:val="24"/>
+        </w:rPr>
+        <w:t>s</w:t>
+      </w:r>
+      <w:r>
+        <w:rPr>
+          <w:rFonts w:ascii="Arial" w:hAnsi="Arial" w:cs="Arial"/>
+          <w:b/>
+          <w:sz w:val="24"/>
+          <w:szCs w:val="24"/>
+        </w:rPr>
+        <w:t>or</w:t>
+      </w:r>
+    </w:p>
+    <w:p>
+      <w:pPr>
+        <w:jc w:val="center"/>
+        <w:rPr>
+          <w:rFonts w:ascii="Arial" w:hAnsi="Arial" w:cs="Arial"/>
+          <w:bCs/>
+          <w:sz w:val="24"/>
+          <w:szCs w:val="24"/>
+        </w:rPr>
+      </w:pPr>
+      <w:r>
+        <w:rPr>
+          <w:rFonts w:ascii="Arial" w:hAnsi="Arial" w:cs="Arial"/>
+          <w:bCs/>
+          <w:sz w:val="24"/>
+          <w:szCs w:val="24"/>
+        </w:rPr>
+        <w:t>Angie Tatiana Medina Gil</w:t>
+      </w:r>
+    </w:p>
+    <w:p>
+      <w:pPr>
+        <w:jc w:val="center"/>
+        <w:rPr>
+          <w:rFonts w:ascii="Arial" w:hAnsi="Arial" w:cs="Arial"/>
+          <w:bCs/>
+          <w:sz w:val="24"/>
+          <w:szCs w:val="24"/>
+        </w:rPr>
+      </w:pPr>
+    </w:p>
+    <w:p>
+      <w:pPr>
+        <w:jc w:val="center"/>
+        <w:rPr>
+          <w:rFonts w:ascii="Arial" w:hAnsi="Arial" w:cs="Arial"/>
+          <w:bCs/>
+          <w:sz w:val="24"/>
+          <w:szCs w:val="24"/>
+        </w:rPr>
+      </w:pPr>
+      <w:r>
+        <w:rPr>
+          <w:rFonts w:ascii="Arial" w:hAnsi="Arial" w:cs="Arial"/>
+          <w:bCs/>
+          <w:sz w:val="24"/>
+          <w:szCs w:val="24"/>
+        </w:rPr>
+        <w:t>DOPO - 1</w:t>
+      </w:r>
+    </w:p>
+    <w:p>
+      <w:pPr>
+        <w:jc w:val="center"/>
+        <w:rPr>
+          <w:b/>
+        </w:rPr>
+      </w:pPr>
+    </w:p>
+    <w:p>
+      <w:pPr>
+        <w:jc w:val="center"/>
+        <w:rPr>
+          <w:b/>
+        </w:rPr>
+      </w:pPr>
+    </w:p>
+    <w:p>
+      <w:pPr>
+        <w:jc w:val="center"/>
+        <w:rPr>
+          <w:b/>
+        </w:rPr>
+      </w:pPr>
+    </w:p>
+    <w:p>
+      <w:pPr>
+        <w:jc w:val="center"/>
+        <w:rPr>
+          <w:b/>
+        </w:rPr>
+      </w:pPr>
+    </w:p>
+    <w:p>
+      <w:pPr>
+        <w:rPr>
+          <w:rFonts w:ascii="Arial" w:hAnsi="Arial" w:cs="Arial"/>
+          <w:b/>
+          <w:sz w:val="24"/>
+          <w:szCs w:val="24"/>
+        </w:rPr>
+      </w:pPr>
+      <w:r>
+        <w:rPr>
+          <w:rFonts w:ascii="Arial" w:hAnsi="Arial" w:cs="Arial"/>
+          <w:b/>
+          <w:sz w:val="24"/>
+          <w:szCs w:val="24"/>
+        </w:rPr>
+        <w:lastRenderedPageBreak/>
+        <w:t>NUEVA MAQUINA</w:t>
+      </w:r>
+    </w:p>
+    <w:p>
+      <w:pPr>
+        <w:jc w:val="both"/>
+        <w:rPr>
+          <w:rFonts w:ascii="Arial" w:hAnsi="Arial" w:cs="Arial"/>
+          <w:bCs/>
+          <w:sz w:val="24"/>
+          <w:szCs w:val="24"/>
+        </w:rPr>
+      </w:pPr>
+      <w:r>
+        <w:rPr>
+          <w:rFonts w:ascii="Arial" w:hAnsi="Arial" w:cs="Arial"/>
+          <w:bCs/>
+          <w:sz w:val="24"/>
+          <w:szCs w:val="24"/>
+        </w:rPr>
+        <w:t>Las flotas ahora van a tener cápsulas submarinas, sin tripulantes, que piden instrucción a una máquina nodriza.</w:t>
+      </w:r>
+      <w:r>
+        <w:rPr>
+          <w:rFonts w:ascii="Arial" w:hAnsi="Arial" w:cs="Arial"/>
+          <w:bCs/>
+          <w:sz w:val="24"/>
+          <w:szCs w:val="24"/>
+        </w:rPr>
+        <w:t xml:space="preserve"> </w:t>
+      </w:r>
+      <w:r>
+        <w:rPr>
+          <w:rFonts w:ascii="Arial" w:hAnsi="Arial" w:cs="Arial"/>
+          <w:bCs/>
+          <w:sz w:val="24"/>
+          <w:szCs w:val="24"/>
+        </w:rPr>
+        <w:t>Las máquinas nodrizas pueden ser un barco u otra cápsula. Las cápsulas alcanzan profundidades superiores a</w:t>
+      </w:r>
+      <w:r>
+        <w:rPr>
+          <w:rFonts w:ascii="Arial" w:hAnsi="Arial" w:cs="Arial"/>
+          <w:bCs/>
+          <w:sz w:val="24"/>
+          <w:szCs w:val="24"/>
+        </w:rPr>
+        <w:t xml:space="preserve"> </w:t>
+      </w:r>
+      <w:r>
+        <w:rPr>
+          <w:rFonts w:ascii="Arial" w:hAnsi="Arial" w:cs="Arial"/>
+          <w:bCs/>
+          <w:sz w:val="24"/>
+          <w:szCs w:val="24"/>
+        </w:rPr>
+        <w:t xml:space="preserve">8.000 </w:t>
+      </w:r>
+      <w:proofErr w:type="spellStart"/>
+      <w:r>
+        <w:rPr>
+          <w:rFonts w:ascii="Arial" w:hAnsi="Arial" w:cs="Arial"/>
+          <w:bCs/>
+          <w:sz w:val="24"/>
+          <w:szCs w:val="24"/>
+        </w:rPr>
+        <w:t>mts</w:t>
+      </w:r>
+      <w:proofErr w:type="spellEnd"/>
+      <w:r>
+        <w:rPr>
+          <w:rFonts w:ascii="Arial" w:hAnsi="Arial" w:cs="Arial"/>
+          <w:bCs/>
+          <w:sz w:val="24"/>
+          <w:szCs w:val="24"/>
+        </w:rPr>
+        <w:t xml:space="preserve"> que las hace inmunes a los ataques y NUNCA son débiles.</w:t>
+      </w:r>
+    </w:p>
+    <w:p>
+      <w:pPr>
+        <w:pStyle w:val="Prrafodelista"/>
+        <w:numPr>
+          <w:ilvl w:val="0"/>
+          <w:numId w:val="1"/>
+        </w:numPr>
+        <w:jc w:val="both"/>
+        <w:rPr>
+          <w:rFonts w:ascii="Arial" w:hAnsi="Arial" w:cs="Arial"/>
+          <w:bCs/>
+          <w:sz w:val="24"/>
+          <w:szCs w:val="24"/>
+        </w:rPr>
+      </w:pPr>
+      <w:r>
+        <w:rPr>
+          <w:rFonts w:ascii="Arial" w:hAnsi="Arial" w:cs="Arial"/>
+          <w:bCs/>
+          <w:sz w:val="24"/>
+          <w:szCs w:val="24"/>
+        </w:rPr>
+        <w:t>Presenten el diseño estructural</w:t>
+      </w:r>
+    </w:p>
+    <w:p>
+      <w:pPr>
+        <w:pStyle w:val="Prrafodelista"/>
+        <w:numPr>
+          <w:ilvl w:val="0"/>
+          <w:numId w:val="1"/>
+        </w:numPr>
+        <w:jc w:val="both"/>
+        <w:rPr>
+          <w:rFonts w:ascii="Arial" w:hAnsi="Arial" w:cs="Arial"/>
+          <w:bCs/>
+          <w:sz w:val="24"/>
+          <w:szCs w:val="24"/>
+        </w:rPr>
+      </w:pPr>
+      <w:r>
+        <w:rPr>
+          <w:rFonts w:ascii="Arial" w:hAnsi="Arial" w:cs="Arial"/>
+          <w:bCs/>
+          <w:sz w:val="24"/>
+          <w:szCs w:val="24"/>
+        </w:rPr>
+        <w:t>Analicen si debe modificar el diseño de los métodos desarrollados.</w:t>
+      </w:r>
+    </w:p>
+    <w:p>
+      <w:pPr>
+        <w:pStyle w:val="Prrafodelista"/>
+        <w:numPr>
+          <w:ilvl w:val="0"/>
+          <w:numId w:val="1"/>
+        </w:numPr>
+        <w:jc w:val="both"/>
+        <w:rPr>
+          <w:rFonts w:ascii="Arial" w:hAnsi="Arial" w:cs="Arial"/>
+          <w:bCs/>
+          <w:sz w:val="24"/>
+          <w:szCs w:val="24"/>
+        </w:rPr>
+      </w:pPr>
+      <w:r>
+        <w:rPr>
+          <w:rFonts w:ascii="Arial" w:hAnsi="Arial" w:cs="Arial"/>
+          <w:bCs/>
+          <w:sz w:val="24"/>
+          <w:szCs w:val="24"/>
+        </w:rPr>
+        <w:t>Diseñen los métodos que requieren cambios.</w:t>
+      </w:r>
+    </w:p>
+    <w:p>
+      <w:pPr>
+        <w:pStyle w:val="Prrafodelista"/>
+        <w:numPr>
+          <w:ilvl w:val="0"/>
+          <w:numId w:val="1"/>
+        </w:numPr>
+        <w:jc w:val="both"/>
+        <w:rPr>
+          <w:rFonts w:ascii="Arial" w:hAnsi="Arial" w:cs="Arial"/>
+          <w:bCs/>
+          <w:sz w:val="24"/>
+          <w:szCs w:val="24"/>
+        </w:rPr>
+      </w:pPr>
+      <w:r>
+        <w:rPr>
+          <w:rFonts w:ascii="Arial" w:hAnsi="Arial" w:cs="Arial"/>
+          <w:bCs/>
+          <w:sz w:val="24"/>
+          <w:szCs w:val="24"/>
+        </w:rPr>
+        <w:t>Realicen la codificación completa de esta nueva clase.</w:t>
+      </w:r>
+    </w:p>
+    <w:p>
+      <w:pPr>
+        <w:jc w:val="both"/>
+        <w:rPr>
+          <w:rFonts w:ascii="Arial" w:hAnsi="Arial" w:cs="Arial"/>
+          <w:b/>
+          <w:sz w:val="24"/>
+          <w:szCs w:val="24"/>
+        </w:rPr>
+      </w:pPr>
+      <w:r>
+        <w:rPr>
+          <w:rFonts w:ascii="Arial" w:hAnsi="Arial" w:cs="Arial"/>
+          <w:b/>
+          <w:sz w:val="24"/>
+          <w:szCs w:val="24"/>
+        </w:rPr>
+        <w:t>NUEVO COMPORTAMIENTO</w:t>
+      </w:r>
+    </w:p>
+    <w:p>
+      <w:pPr>
+        <w:jc w:val="both"/>
+        <w:rPr>
+          <w:rFonts w:ascii="Arial" w:hAnsi="Arial" w:cs="Arial"/>
+          <w:bCs/>
+          <w:sz w:val="24"/>
+          <w:szCs w:val="24"/>
+        </w:rPr>
+      </w:pPr>
+      <w:r>
+        <w:rPr>
+          <w:rFonts w:ascii="Arial" w:hAnsi="Arial" w:cs="Arial"/>
+          <w:bCs/>
+          <w:sz w:val="24"/>
+          <w:szCs w:val="24"/>
+        </w:rPr>
+        <w:t xml:space="preserve">Los marinos, aviones y cápsulas están preparados para </w:t>
+      </w:r>
+      <w:proofErr w:type="spellStart"/>
+      <w:proofErr w:type="gramStart"/>
+      <w:r>
+        <w:rPr>
+          <w:rFonts w:ascii="Arial" w:hAnsi="Arial" w:cs="Arial"/>
+          <w:bCs/>
+          <w:sz w:val="24"/>
+          <w:szCs w:val="24"/>
+        </w:rPr>
+        <w:t>auto-destruirse</w:t>
+      </w:r>
+      <w:proofErr w:type="spellEnd"/>
+      <w:proofErr w:type="gramEnd"/>
+      <w:r>
+        <w:rPr>
+          <w:rFonts w:ascii="Arial" w:hAnsi="Arial" w:cs="Arial"/>
+          <w:bCs/>
+          <w:sz w:val="24"/>
+          <w:szCs w:val="24"/>
+        </w:rPr>
+        <w:t>. Los marinos y barcos se autodestruyen si</w:t>
+      </w:r>
+      <w:r>
+        <w:rPr>
+          <w:rFonts w:ascii="Arial" w:hAnsi="Arial" w:cs="Arial"/>
+          <w:bCs/>
+          <w:sz w:val="24"/>
+          <w:szCs w:val="24"/>
+        </w:rPr>
+        <w:t xml:space="preserve"> </w:t>
+      </w:r>
+      <w:r>
+        <w:rPr>
+          <w:rFonts w:ascii="Arial" w:hAnsi="Arial" w:cs="Arial"/>
+          <w:bCs/>
+          <w:sz w:val="24"/>
+          <w:szCs w:val="24"/>
+        </w:rPr>
+        <w:t>reciben la instrucción. Las cápsulas se autodestruyen si su nodriza es destruida.</w:t>
+      </w:r>
+      <w:r>
+        <w:rPr>
+          <w:rFonts w:ascii="Arial" w:hAnsi="Arial" w:cs="Arial"/>
+          <w:bCs/>
+          <w:sz w:val="24"/>
+          <w:szCs w:val="24"/>
+        </w:rPr>
+        <w:t xml:space="preserve"> </w:t>
+      </w:r>
+      <w:r>
+        <w:rPr>
+          <w:rFonts w:ascii="Arial" w:hAnsi="Arial" w:cs="Arial"/>
+          <w:bCs/>
+          <w:sz w:val="24"/>
+          <w:szCs w:val="24"/>
+        </w:rPr>
+        <w:t>Todos deben poder informar la causa por la que tomaron la decisión. Las flotas conocen todos los elementos que</w:t>
+      </w:r>
+      <w:r>
+        <w:rPr>
+          <w:rFonts w:ascii="Arial" w:hAnsi="Arial" w:cs="Arial"/>
+          <w:bCs/>
+          <w:sz w:val="24"/>
+          <w:szCs w:val="24"/>
+        </w:rPr>
+        <w:t xml:space="preserve"> </w:t>
+      </w:r>
+      <w:r>
+        <w:rPr>
+          <w:rFonts w:ascii="Arial" w:hAnsi="Arial" w:cs="Arial"/>
+          <w:bCs/>
+          <w:sz w:val="24"/>
+          <w:szCs w:val="24"/>
+        </w:rPr>
+        <w:t>se han auto destruido.</w:t>
+      </w:r>
+    </w:p>
+    <w:p>
+      <w:pPr>
+        <w:pStyle w:val="Prrafodelista"/>
+        <w:numPr>
+          <w:ilvl w:val="0"/>
+          <w:numId w:val="2"/>
+        </w:numPr>
+        <w:rPr>
+          <w:rFonts w:ascii="Arial" w:hAnsi="Arial" w:cs="Arial"/>
+          <w:bCs/>
+          <w:sz w:val="24"/>
+          <w:szCs w:val="24"/>
+        </w:rPr>
+      </w:pPr>
+      <w:r>
+        <w:rPr>
+          <w:rFonts w:ascii="Arial" w:hAnsi="Arial" w:cs="Arial"/>
+          <w:bCs/>
+          <w:sz w:val="24"/>
+          <w:szCs w:val="24"/>
+        </w:rPr>
+        <w:t>Presenten el diseño estructural</w:t>
+      </w:r>
+    </w:p>
+    <w:p>
+      <w:pPr>
+        <w:pStyle w:val="Prrafodelista"/>
+        <w:numPr>
+          <w:ilvl w:val="0"/>
+          <w:numId w:val="2"/>
+        </w:numPr>
+        <w:rPr>
+          <w:rFonts w:ascii="Arial" w:hAnsi="Arial" w:cs="Arial"/>
+          <w:bCs/>
+          <w:sz w:val="24"/>
+          <w:szCs w:val="24"/>
+        </w:rPr>
+      </w:pPr>
+      <w:r>
+        <w:rPr>
+          <w:rFonts w:ascii="Arial" w:hAnsi="Arial" w:cs="Arial"/>
+          <w:bCs/>
+          <w:sz w:val="24"/>
+          <w:szCs w:val="24"/>
+        </w:rPr>
+        <w:t>Realicen la codificación completa del nuevo elemento.</w:t>
+      </w:r>
+    </w:p>
+    <w:p>
+      <w:pPr>
+        <w:rPr>
+          <w:rFonts w:ascii="Arial" w:hAnsi="Arial" w:cs="Arial"/>
+          <w:bCs/>
+          <w:sz w:val="24"/>
+          <w:szCs w:val="24"/>
+        </w:rPr>
+      </w:pPr>
+    </w:p>
+    <w:p>
+      <w:pPr>
+        <w:jc w:val="both"/>
+        <w:rPr>
+          <w:rFonts w:ascii="Arial" w:hAnsi="Arial" w:cs="Arial"/>
+          <w:bCs/>
+          <w:sz w:val="24"/>
+          <w:szCs w:val="24"/>
+        </w:rPr>
+      </w:pPr>
+      <w:r>
+        <w:rPr>
+          <w:rFonts w:ascii="Arial" w:hAnsi="Arial" w:cs="Arial"/>
+          <w:bCs/>
+          <w:sz w:val="24"/>
+          <w:szCs w:val="24"/>
+        </w:rPr>
+        <w:t>Este es el diagrama de clases con la nueva máquina, el nuevo comportamiento, y dos nuevas interfaces que se añadieron, se hizo la interfaz “</w:t>
+      </w:r>
+      <w:proofErr w:type="spellStart"/>
+      <w:r>
+        <w:rPr>
+          <w:rFonts w:ascii="Arial" w:hAnsi="Arial" w:cs="Arial"/>
+          <w:bCs/>
+          <w:sz w:val="24"/>
+          <w:szCs w:val="24"/>
+        </w:rPr>
+        <w:t>MaquinaNodriza</w:t>
+      </w:r>
+      <w:proofErr w:type="spellEnd"/>
+      <w:r>
+        <w:rPr>
+          <w:rFonts w:ascii="Arial" w:hAnsi="Arial" w:cs="Arial"/>
+          <w:bCs/>
+          <w:sz w:val="24"/>
+          <w:szCs w:val="24"/>
+        </w:rPr>
+        <w:t>” porque al ser un rol que pueden tener tanto la nueva Capsula como la Ship, decidimos que hacer una interfaz es la mejor opción por los métodos que únicamente podrían implementar estas dos clases, no puede ser una clase abstracta porque las clases solo pueden tener una superclase.</w:t>
+      </w:r>
+    </w:p>
+    <w:p>
+      <w:pPr>
+        <w:jc w:val="both"/>
+        <w:rPr>
+          <w:rFonts w:ascii="Arial" w:hAnsi="Arial" w:cs="Arial"/>
+          <w:bCs/>
+          <w:sz w:val="24"/>
+          <w:szCs w:val="24"/>
+        </w:rPr>
+      </w:pPr>
+      <w:r>
+        <w:rPr>
+          <w:rFonts w:ascii="Arial" w:hAnsi="Arial" w:cs="Arial"/>
+          <w:bCs/>
+          <w:sz w:val="24"/>
+          <w:szCs w:val="24"/>
         </w:rPr>
         <w:drawing>
-          <wp:inline distT="0" distB="0" distL="0" distR="0" wp14:anchorId="7D685ACD" wp14:editId="7FFACF35">
-            <wp:extent cx="5612130" cy="3373120"/>
-            <wp:effectExtent l="0" t="0" r="7620" b="0"/>
-            <wp:docPr id="2" name="Imagen 2"/>
+          <wp:inline distT="0" distB="0" distL="0" distR="0" wp14:anchorId="285FC07F" wp14:editId="4A45D053">
+            <wp:extent cx="5608320" cy="2517775"/>
+            <wp:effectExtent l="0" t="0" r="0" b="0"/>
+            <wp:docPr id="1459354810" name="Imagen 1"/>
             <wp:cNvGraphicFramePr>
               <a:graphicFrameLocks xmlns:a="http://schemas.openxmlformats.org/drawingml/2006/main" noChangeAspect="1"/>
             </wp:cNvGraphicFramePr>
@@ -87,56 +915,7 @@
               <a:graphicData uri="http://schemas.openxmlformats.org/drawingml/2006/picture">
                 <pic:pic xmlns:pic="http://schemas.openxmlformats.org/drawingml/2006/picture">
                   <pic:nvPicPr>
-                    <pic:cNvPr id="1" name=""/>
-                    <pic:cNvPicPr/>
-                  </pic:nvPicPr>
-                  <pic:blipFill>
-                    <a:blip r:embed="rId5"/>
-                    <a:stretch>
-                      <a:fillRect/>
-                    </a:stretch>
-                  </pic:blipFill>
-                  <pic:spPr>
-                    <a:xfrm>
-                      <a:off x="0" y="0"/>
-                      <a:ext cx="5612130" cy="3373120"/>
-                    </a:xfrm>
-                    <a:prstGeom prst="rect">
-                      <a:avLst/>
-                    </a:prstGeom>
-                  </pic:spPr>
-                </pic:pic>
-              </a:graphicData>
-            </a:graphic>
-          </wp:inline>
-        </w:drawing>
-      </w:r>
-    </w:p>
-    <w:p>
-      <w:pPr>
-        <w:jc w:val="center"/>
-        <w:rPr>
-          <w:b/>
-        </w:rPr>
-      </w:pPr>
-      <w:r>
-        <w:rPr>
-          <w:b/>
-        </w:rPr>
-        <w:lastRenderedPageBreak/>
-        <w:drawing>
-          <wp:inline distT="0" distB="0" distL="0" distR="0" wp14:anchorId="68E30300" wp14:editId="35920C51">
-            <wp:extent cx="5612130" cy="3271520"/>
-            <wp:effectExtent l="0" t="0" r="7620" b="5080"/>
-            <wp:docPr id="3" name="Imagen 3"/>
-            <wp:cNvGraphicFramePr>
-              <a:graphicFrameLocks xmlns:a="http://schemas.openxmlformats.org/drawingml/2006/main" noChangeAspect="1"/>
-            </wp:cNvGraphicFramePr>
-            <a:graphic xmlns:a="http://schemas.openxmlformats.org/drawingml/2006/main">
-              <a:graphicData uri="http://schemas.openxmlformats.org/drawingml/2006/picture">
-                <pic:pic xmlns:pic="http://schemas.openxmlformats.org/drawingml/2006/picture">
-                  <pic:nvPicPr>
-                    <pic:cNvPr id="1" name=""/>
+                    <pic:cNvPr id="1459354810" name=""/>
                     <pic:cNvPicPr/>
                   </pic:nvPicPr>
                   <pic:blipFill>
@@ -148,7 +927,7 @@
                   <pic:spPr>
                     <a:xfrm>
                       <a:off x="0" y="0"/>
-                      <a:ext cx="5612130" cy="3271520"/>
+                      <a:ext cx="5636763" cy="2530544"/>
                     </a:xfrm>
                     <a:prstGeom prst="rect">
                       <a:avLst/>
@@ -160,8 +939,398 @@
           </wp:inline>
         </w:drawing>
       </w:r>
-      <w:bookmarkStart w:id="0" w:name="_GoBack"/>
-      <w:bookmarkEnd w:id="0"/>
+    </w:p>
+    <w:p>
+      <w:pPr>
+        <w:jc w:val="both"/>
+        <w:rPr>
+          <w:rFonts w:ascii="Arial" w:hAnsi="Arial" w:cs="Arial"/>
+          <w:bCs/>
+          <w:sz w:val="24"/>
+          <w:szCs w:val="24"/>
+        </w:rPr>
+      </w:pPr>
+      <w:r>
+        <w:rPr>
+          <w:rFonts w:ascii="Arial" w:hAnsi="Arial" w:cs="Arial"/>
+          <w:bCs/>
+          <w:sz w:val="24"/>
+          <w:szCs w:val="24"/>
+        </w:rPr>
+        <w:lastRenderedPageBreak/>
+        <w:t>Para la nueva maquina se tuvo que cambiar el método “</w:t>
+      </w:r>
+      <w:proofErr w:type="spellStart"/>
+      <w:proofErr w:type="gramStart"/>
+      <w:r>
+        <w:rPr>
+          <w:rFonts w:ascii="Arial" w:hAnsi="Arial" w:cs="Arial"/>
+          <w:bCs/>
+          <w:sz w:val="24"/>
+          <w:szCs w:val="24"/>
+        </w:rPr>
+        <w:t>willBeDestroyed</w:t>
+      </w:r>
+      <w:proofErr w:type="spellEnd"/>
+      <w:r>
+        <w:rPr>
+          <w:rFonts w:ascii="Arial" w:hAnsi="Arial" w:cs="Arial"/>
+          <w:bCs/>
+          <w:sz w:val="24"/>
+          <w:szCs w:val="24"/>
+        </w:rPr>
+        <w:t>(</w:t>
+      </w:r>
+      <w:proofErr w:type="gramEnd"/>
+      <w:r>
+        <w:rPr>
+          <w:rFonts w:ascii="Arial" w:hAnsi="Arial" w:cs="Arial"/>
+          <w:bCs/>
+          <w:sz w:val="24"/>
+          <w:szCs w:val="24"/>
+        </w:rPr>
+        <w:t xml:space="preserve">)” por lo que este dependería principalmente de la profundidad de la maquina como nos lo mencionan en el enunciado. El código de la clase </w:t>
+      </w:r>
+      <w:proofErr w:type="gramStart"/>
+      <w:r>
+        <w:rPr>
+          <w:rFonts w:ascii="Arial" w:hAnsi="Arial" w:cs="Arial"/>
+          <w:bCs/>
+          <w:sz w:val="24"/>
+          <w:szCs w:val="24"/>
+        </w:rPr>
+        <w:t>seria</w:t>
+      </w:r>
+      <w:proofErr w:type="gramEnd"/>
+      <w:r>
+        <w:rPr>
+          <w:rFonts w:ascii="Arial" w:hAnsi="Arial" w:cs="Arial"/>
+          <w:bCs/>
+          <w:sz w:val="24"/>
+          <w:szCs w:val="24"/>
+        </w:rPr>
+        <w:t xml:space="preserve"> el siguiente:</w:t>
+      </w:r>
+    </w:p>
+    <w:p>
+      <w:pPr>
+        <w:jc w:val="both"/>
+        <w:rPr>
+          <w:rFonts w:ascii="Arial" w:hAnsi="Arial" w:cs="Arial"/>
+          <w:bCs/>
+          <w:sz w:val="24"/>
+          <w:szCs w:val="24"/>
+        </w:rPr>
+      </w:pPr>
+      <w:r>
+        <w:rPr>
+          <w:rFonts w:ascii="Arial" w:hAnsi="Arial" w:cs="Arial"/>
+          <w:bCs/>
+          <w:sz w:val="24"/>
+          <w:szCs w:val="24"/>
+        </w:rPr>
+        <w:drawing>
+          <wp:inline distT="0" distB="0" distL="0" distR="0" wp14:anchorId="30B17C7E" wp14:editId="4F408E36">
+            <wp:extent cx="5612130" cy="4416425"/>
+            <wp:effectExtent l="0" t="0" r="7620" b="3175"/>
+            <wp:docPr id="1747100855" name="Imagen 1"/>
+            <wp:cNvGraphicFramePr>
+              <a:graphicFrameLocks xmlns:a="http://schemas.openxmlformats.org/drawingml/2006/main" noChangeAspect="1"/>
+            </wp:cNvGraphicFramePr>
+            <a:graphic xmlns:a="http://schemas.openxmlformats.org/drawingml/2006/main">
+              <a:graphicData uri="http://schemas.openxmlformats.org/drawingml/2006/picture">
+                <pic:pic xmlns:pic="http://schemas.openxmlformats.org/drawingml/2006/picture">
+                  <pic:nvPicPr>
+                    <pic:cNvPr id="1747100855" name=""/>
+                    <pic:cNvPicPr/>
+                  </pic:nvPicPr>
+                  <pic:blipFill>
+                    <a:blip r:embed="rId7"/>
+                    <a:stretch>
+                      <a:fillRect/>
+                    </a:stretch>
+                  </pic:blipFill>
+                  <pic:spPr>
+                    <a:xfrm>
+                      <a:off x="0" y="0"/>
+                      <a:ext cx="5612130" cy="4416425"/>
+                    </a:xfrm>
+                    <a:prstGeom prst="rect">
+                      <a:avLst/>
+                    </a:prstGeom>
+                  </pic:spPr>
+                </pic:pic>
+              </a:graphicData>
+            </a:graphic>
+          </wp:inline>
+        </w:drawing>
+      </w:r>
+    </w:p>
+    <w:p>
+      <w:pPr>
+        <w:jc w:val="both"/>
+        <w:rPr>
+          <w:rFonts w:ascii="Arial" w:hAnsi="Arial" w:cs="Arial"/>
+          <w:bCs/>
+          <w:sz w:val="24"/>
+          <w:szCs w:val="24"/>
+        </w:rPr>
+      </w:pPr>
+      <w:r>
+        <w:rPr>
+          <w:rFonts w:ascii="Arial" w:hAnsi="Arial" w:cs="Arial"/>
+          <w:bCs/>
+          <w:sz w:val="24"/>
+          <w:szCs w:val="24"/>
+        </w:rPr>
+        <w:lastRenderedPageBreak/>
+        <w:drawing>
+          <wp:inline distT="0" distB="0" distL="0" distR="0" wp14:anchorId="16D4D0DE" wp14:editId="5B8C3D08">
+            <wp:extent cx="5612130" cy="3869690"/>
+            <wp:effectExtent l="0" t="0" r="7620" b="0"/>
+            <wp:docPr id="1749861087" name="Imagen 1"/>
+            <wp:cNvGraphicFramePr>
+              <a:graphicFrameLocks xmlns:a="http://schemas.openxmlformats.org/drawingml/2006/main" noChangeAspect="1"/>
+            </wp:cNvGraphicFramePr>
+            <a:graphic xmlns:a="http://schemas.openxmlformats.org/drawingml/2006/main">
+              <a:graphicData uri="http://schemas.openxmlformats.org/drawingml/2006/picture">
+                <pic:pic xmlns:pic="http://schemas.openxmlformats.org/drawingml/2006/picture">
+                  <pic:nvPicPr>
+                    <pic:cNvPr id="1749861087" name=""/>
+                    <pic:cNvPicPr/>
+                  </pic:nvPicPr>
+                  <pic:blipFill>
+                    <a:blip r:embed="rId8"/>
+                    <a:stretch>
+                      <a:fillRect/>
+                    </a:stretch>
+                  </pic:blipFill>
+                  <pic:spPr>
+                    <a:xfrm>
+                      <a:off x="0" y="0"/>
+                      <a:ext cx="5612130" cy="3869690"/>
+                    </a:xfrm>
+                    <a:prstGeom prst="rect">
+                      <a:avLst/>
+                    </a:prstGeom>
+                  </pic:spPr>
+                </pic:pic>
+              </a:graphicData>
+            </a:graphic>
+          </wp:inline>
+        </w:drawing>
+      </w:r>
+      <w:r>
+        <w:rPr>
+          <w:rFonts w:ascii="Arial" w:hAnsi="Arial" w:cs="Arial"/>
+          <w:bCs/>
+          <w:sz w:val="24"/>
+          <w:szCs w:val="24"/>
+        </w:rPr>
+        <w:drawing>
+          <wp:inline distT="0" distB="0" distL="0" distR="0" wp14:anchorId="086E39CF" wp14:editId="3F00677A">
+            <wp:extent cx="5612130" cy="3080385"/>
+            <wp:effectExtent l="0" t="0" r="7620" b="5715"/>
+            <wp:docPr id="1659861292" name="Imagen 1"/>
+            <wp:cNvGraphicFramePr>
+              <a:graphicFrameLocks xmlns:a="http://schemas.openxmlformats.org/drawingml/2006/main" noChangeAspect="1"/>
+            </wp:cNvGraphicFramePr>
+            <a:graphic xmlns:a="http://schemas.openxmlformats.org/drawingml/2006/main">
+              <a:graphicData uri="http://schemas.openxmlformats.org/drawingml/2006/picture">
+                <pic:pic xmlns:pic="http://schemas.openxmlformats.org/drawingml/2006/picture">
+                  <pic:nvPicPr>
+                    <pic:cNvPr id="1659861292" name=""/>
+                    <pic:cNvPicPr/>
+                  </pic:nvPicPr>
+                  <pic:blipFill>
+                    <a:blip r:embed="rId9"/>
+                    <a:stretch>
+                      <a:fillRect/>
+                    </a:stretch>
+                  </pic:blipFill>
+                  <pic:spPr>
+                    <a:xfrm>
+                      <a:off x="0" y="0"/>
+                      <a:ext cx="5612130" cy="3080385"/>
+                    </a:xfrm>
+                    <a:prstGeom prst="rect">
+                      <a:avLst/>
+                    </a:prstGeom>
+                  </pic:spPr>
+                </pic:pic>
+              </a:graphicData>
+            </a:graphic>
+          </wp:inline>
+        </w:drawing>
+      </w:r>
+    </w:p>
+    <w:p>
+      <w:pPr>
+        <w:jc w:val="both"/>
+        <w:rPr>
+          <w:rFonts w:ascii="Arial" w:hAnsi="Arial" w:cs="Arial"/>
+          <w:bCs/>
+          <w:sz w:val="24"/>
+          <w:szCs w:val="24"/>
+        </w:rPr>
+      </w:pPr>
+    </w:p>
+    <w:p>
+      <w:pPr>
+        <w:jc w:val="both"/>
+        <w:rPr>
+          <w:rFonts w:ascii="Arial" w:hAnsi="Arial" w:cs="Arial"/>
+          <w:bCs/>
+          <w:sz w:val="24"/>
+          <w:szCs w:val="24"/>
+        </w:rPr>
+      </w:pPr>
+    </w:p>
+    <w:p>
+      <w:pPr>
+        <w:jc w:val="both"/>
+        <w:rPr>
+          <w:rFonts w:ascii="Arial" w:hAnsi="Arial" w:cs="Arial"/>
+          <w:bCs/>
+          <w:sz w:val="24"/>
+          <w:szCs w:val="24"/>
+        </w:rPr>
+      </w:pPr>
+    </w:p>
+    <w:p>
+      <w:pPr>
+        <w:jc w:val="both"/>
+        <w:rPr>
+          <w:rFonts w:ascii="Arial" w:hAnsi="Arial" w:cs="Arial"/>
+          <w:bCs/>
+          <w:sz w:val="24"/>
+          <w:szCs w:val="24"/>
+        </w:rPr>
+      </w:pPr>
+      <w:r>
+        <w:rPr>
+          <w:rFonts w:ascii="Arial" w:hAnsi="Arial" w:cs="Arial"/>
+          <w:bCs/>
+          <w:sz w:val="24"/>
+          <w:szCs w:val="24"/>
+        </w:rPr>
+        <w:lastRenderedPageBreak/>
+        <w:t xml:space="preserve">Para que funcionara bien el comportamiento de las clases también se les diseño un constructor, como una maquina nodriza puede ser una capsula o una </w:t>
+      </w:r>
+      <w:proofErr w:type="spellStart"/>
+      <w:r>
+        <w:rPr>
+          <w:rFonts w:ascii="Arial" w:hAnsi="Arial" w:cs="Arial"/>
+          <w:bCs/>
+          <w:sz w:val="24"/>
+          <w:szCs w:val="24"/>
+        </w:rPr>
+        <w:t>ship</w:t>
+      </w:r>
+      <w:proofErr w:type="spellEnd"/>
+      <w:r>
+        <w:rPr>
+          <w:rFonts w:ascii="Arial" w:hAnsi="Arial" w:cs="Arial"/>
+          <w:bCs/>
+          <w:sz w:val="24"/>
+          <w:szCs w:val="24"/>
+        </w:rPr>
+        <w:t xml:space="preserve">, haciendo que estas sean responsables de mas maquinas, se les hizo un atributo de las capsulas de las que serian responsables, esto principalmente porque cuando toca añadir el nuevo comportamiento, si una maquina que es nodriza se autodestruye, las maquinas que tienen asignada esta </w:t>
+      </w:r>
+      <w:proofErr w:type="spellStart"/>
+      <w:r>
+        <w:rPr>
+          <w:rFonts w:ascii="Arial" w:hAnsi="Arial" w:cs="Arial"/>
+          <w:bCs/>
+          <w:sz w:val="24"/>
+          <w:szCs w:val="24"/>
+        </w:rPr>
+        <w:t>maquina</w:t>
+      </w:r>
+      <w:proofErr w:type="spellEnd"/>
+      <w:r>
+        <w:rPr>
+          <w:rFonts w:ascii="Arial" w:hAnsi="Arial" w:cs="Arial"/>
+          <w:bCs/>
+          <w:sz w:val="24"/>
+          <w:szCs w:val="24"/>
+        </w:rPr>
+        <w:t xml:space="preserve"> como nodriza también se destruyen, entonces ese método tendría un comportamiento diferente en la clase </w:t>
+      </w:r>
+      <w:proofErr w:type="spellStart"/>
+      <w:r>
+        <w:rPr>
+          <w:rFonts w:ascii="Arial" w:hAnsi="Arial" w:cs="Arial"/>
+          <w:bCs/>
+          <w:sz w:val="24"/>
+          <w:szCs w:val="24"/>
+        </w:rPr>
+        <w:t>CapsulaSubmarina</w:t>
+      </w:r>
+      <w:proofErr w:type="spellEnd"/>
+      <w:r>
+        <w:rPr>
+          <w:rFonts w:ascii="Arial" w:hAnsi="Arial" w:cs="Arial"/>
+          <w:bCs/>
+          <w:sz w:val="24"/>
+          <w:szCs w:val="24"/>
+        </w:rPr>
+        <w:t>.</w:t>
+      </w:r>
+    </w:p>
+    <w:p>
+      <w:pPr>
+        <w:jc w:val="both"/>
+        <w:rPr>
+          <w:rFonts w:ascii="Arial" w:hAnsi="Arial" w:cs="Arial"/>
+          <w:bCs/>
+          <w:sz w:val="24"/>
+          <w:szCs w:val="24"/>
+        </w:rPr>
+      </w:pPr>
+      <w:r>
+        <w:rPr>
+          <w:rFonts w:ascii="Arial" w:hAnsi="Arial" w:cs="Arial"/>
+          <w:bCs/>
+          <w:sz w:val="24"/>
+          <w:szCs w:val="24"/>
+        </w:rPr>
+        <w:drawing>
+          <wp:inline distT="0" distB="0" distL="0" distR="0" wp14:anchorId="1C48E4A7" wp14:editId="7E7542E1">
+            <wp:extent cx="5612130" cy="1603375"/>
+            <wp:effectExtent l="0" t="0" r="7620" b="0"/>
+            <wp:docPr id="1478859881" name="Imagen 1"/>
+            <wp:cNvGraphicFramePr>
+              <a:graphicFrameLocks xmlns:a="http://schemas.openxmlformats.org/drawingml/2006/main" noChangeAspect="1"/>
+            </wp:cNvGraphicFramePr>
+            <a:graphic xmlns:a="http://schemas.openxmlformats.org/drawingml/2006/main">
+              <a:graphicData uri="http://schemas.openxmlformats.org/drawingml/2006/picture">
+                <pic:pic xmlns:pic="http://schemas.openxmlformats.org/drawingml/2006/picture">
+                  <pic:nvPicPr>
+                    <pic:cNvPr id="1478859881" name=""/>
+                    <pic:cNvPicPr/>
+                  </pic:nvPicPr>
+                  <pic:blipFill>
+                    <a:blip r:embed="rId10"/>
+                    <a:stretch>
+                      <a:fillRect/>
+                    </a:stretch>
+                  </pic:blipFill>
+                  <pic:spPr>
+                    <a:xfrm>
+                      <a:off x="0" y="0"/>
+                      <a:ext cx="5612130" cy="1603375"/>
+                    </a:xfrm>
+                    <a:prstGeom prst="rect">
+                      <a:avLst/>
+                    </a:prstGeom>
+                  </pic:spPr>
+                </pic:pic>
+              </a:graphicData>
+            </a:graphic>
+          </wp:inline>
+        </w:drawing>
+      </w:r>
     </w:p>
     <w:sectPr>
       <w:pgSz w:w="12240" w:h="15840"/>
@@ -173,8 +1342,245 @@
 </w:document>
 </file>
 
+<file path=word/numbering.xml><?xml version="1.0" encoding="utf-8"?>
+<w:numbering xmlns:wpc="http://schemas.microsoft.com/office/word/2010/wordprocessingCanvas" xmlns:cx="http://schemas.microsoft.com/office/drawing/2014/chartex" xmlns:cx1="http://schemas.microsoft.com/office/drawing/2015/9/8/chartex" xmlns:cx2="http://schemas.microsoft.com/office/drawing/2015/10/21/chartex" xmlns:cx3="http://schemas.microsoft.com/office/drawing/2016/5/9/chartex" xmlns:cx4="http://schemas.microsoft.com/office/drawing/2016/5/10/chartex" xmlns:cx5="http://schemas.microsoft.com/office/drawing/2016/5/11/chartex" xmlns:cx6="http://schemas.microsoft.com/office/drawing/2016/5/12/chartex" xmlns:cx7="http://schemas.microsoft.com/office/drawing/2016/5/13/chartex" xmlns:cx8="http://schemas.microsoft.com/office/drawing/2016/5/14/chartex" xmlns:mc="http://schemas.openxmlformats.org/markup-compatibility/2006" xmlns:aink="http://schemas.microsoft.com/office/drawing/2016/ink" xmlns:am3d="http://schemas.microsoft.com/office/drawing/2017/model3d" xmlns:o="urn:schemas-microsoft-com:office:office" xmlns:oel="http://schemas.microsoft.com/office/2019/extlst" xmlns:r="http://schemas.openxmlformats.org/officeDocument/2006/relationships" xmlns:m="http://schemas.openxmlformats.org/officeDocument/2006/math" xmlns:v="urn:schemas-microsoft-com:vml" xmlns:wp14="http://schemas.microsoft.com/office/word/2010/wordprocessingDrawing" xmlns:wp="http://schemas.openxmlformats.org/drawingml/2006/wordprocessingDrawing" xmlns:w10="urn:schemas-microsoft-com:office:word" xmlns:w="http://schemas.openxmlformats.org/wordprocessingml/2006/main" xmlns:w14="http://schemas.microsoft.com/office/word/2010/wordml" xmlns:w15="http://schemas.microsoft.com/office/word/2012/wordml" xmlns:w16cex="http://schemas.microsoft.com/office/word/2018/wordml/cex" xmlns:w16cid="http://schemas.microsoft.com/office/word/2016/wordml/cid" xmlns:w16="http://schemas.microsoft.com/office/word/2018/wordml" xmlns:w16du="http://schemas.microsoft.com/office/word/2023/wordml/word16du" xmlns:w16sdtdh="http://schemas.microsoft.com/office/word/2020/wordml/sdtdatahash" xmlns:w16sdtfl="http://schemas.microsoft.com/office/word/2024/wordml/sdtformatlock" xmlns:w16se="http://schemas.microsoft.com/office/word/2015/wordml/symex" xmlns:wpg="http://schemas.microsoft.com/office/word/2010/wordprocessingGroup" xmlns:wpi="http://schemas.microsoft.com/office/word/2010/wordprocessingInk" xmlns:wne="http://schemas.microsoft.com/office/word/2006/wordml" xmlns:wps="http://schemas.microsoft.com/office/word/2010/wordprocessingShape" mc:Ignorable="w14 w15 w16se w16cid w16 w16cex w16sdtdh w16sdtfl w16du wp14">
+  <w:abstractNum w:abstractNumId="0" w15:restartNumberingAfterBreak="0">
+    <w:nsid w:val="02662D3E"/>
+    <w:multiLevelType w:val="hybridMultilevel"/>
+    <w:tmpl w:val="D6E81744"/>
+    <w:lvl w:ilvl="0" w:tplc="240A0001">
+      <w:start w:val="1"/>
+      <w:numFmt w:val="bullet"/>
+      <w:lvlText w:val=""/>
+      <w:lvlJc w:val="left"/>
+      <w:pPr>
+        <w:ind w:left="720" w:hanging="360"/>
+      </w:pPr>
+      <w:rPr>
+        <w:rFonts w:ascii="Symbol" w:hAnsi="Symbol" w:hint="default"/>
+      </w:rPr>
+    </w:lvl>
+    <w:lvl w:ilvl="1" w:tplc="240A0003" w:tentative="1">
+      <w:start w:val="1"/>
+      <w:numFmt w:val="bullet"/>
+      <w:lvlText w:val="o"/>
+      <w:lvlJc w:val="left"/>
+      <w:pPr>
+        <w:ind w:left="1440" w:hanging="360"/>
+      </w:pPr>
+      <w:rPr>
+        <w:rFonts w:ascii="Courier New" w:hAnsi="Courier New" w:cs="Courier New" w:hint="default"/>
+      </w:rPr>
+    </w:lvl>
+    <w:lvl w:ilvl="2" w:tplc="240A0005" w:tentative="1">
+      <w:start w:val="1"/>
+      <w:numFmt w:val="bullet"/>
+      <w:lvlText w:val=""/>
+      <w:lvlJc w:val="left"/>
+      <w:pPr>
+        <w:ind w:left="2160" w:hanging="360"/>
+      </w:pPr>
+      <w:rPr>
+        <w:rFonts w:ascii="Wingdings" w:hAnsi="Wingdings" w:hint="default"/>
+      </w:rPr>
+    </w:lvl>
+    <w:lvl w:ilvl="3" w:tplc="240A0001" w:tentative="1">
+      <w:start w:val="1"/>
+      <w:numFmt w:val="bullet"/>
+      <w:lvlText w:val=""/>
+      <w:lvlJc w:val="left"/>
+      <w:pPr>
+        <w:ind w:left="2880" w:hanging="360"/>
+      </w:pPr>
+      <w:rPr>
+        <w:rFonts w:ascii="Symbol" w:hAnsi="Symbol" w:hint="default"/>
+      </w:rPr>
+    </w:lvl>
+    <w:lvl w:ilvl="4" w:tplc="240A0003" w:tentative="1">
+      <w:start w:val="1"/>
+      <w:numFmt w:val="bullet"/>
+      <w:lvlText w:val="o"/>
+      <w:lvlJc w:val="left"/>
+      <w:pPr>
+        <w:ind w:left="3600" w:hanging="360"/>
+      </w:pPr>
+      <w:rPr>
+        <w:rFonts w:ascii="Courier New" w:hAnsi="Courier New" w:cs="Courier New" w:hint="default"/>
+      </w:rPr>
+    </w:lvl>
+    <w:lvl w:ilvl="5" w:tplc="240A0005" w:tentative="1">
+      <w:start w:val="1"/>
+      <w:numFmt w:val="bullet"/>
+      <w:lvlText w:val=""/>
+      <w:lvlJc w:val="left"/>
+      <w:pPr>
+        <w:ind w:left="4320" w:hanging="360"/>
+      </w:pPr>
+      <w:rPr>
+        <w:rFonts w:ascii="Wingdings" w:hAnsi="Wingdings" w:hint="default"/>
+      </w:rPr>
+    </w:lvl>
+    <w:lvl w:ilvl="6" w:tplc="240A0001" w:tentative="1">
+      <w:start w:val="1"/>
+      <w:numFmt w:val="bullet"/>
+      <w:lvlText w:val=""/>
+      <w:lvlJc w:val="left"/>
+      <w:pPr>
+        <w:ind w:left="5040" w:hanging="360"/>
+      </w:pPr>
+      <w:rPr>
+        <w:rFonts w:ascii="Symbol" w:hAnsi="Symbol" w:hint="default"/>
+      </w:rPr>
+    </w:lvl>
+    <w:lvl w:ilvl="7" w:tplc="240A0003" w:tentative="1">
+      <w:start w:val="1"/>
+      <w:numFmt w:val="bullet"/>
+      <w:lvlText w:val="o"/>
+      <w:lvlJc w:val="left"/>
+      <w:pPr>
+        <w:ind w:left="5760" w:hanging="360"/>
+      </w:pPr>
+      <w:rPr>
+        <w:rFonts w:ascii="Courier New" w:hAnsi="Courier New" w:cs="Courier New" w:hint="default"/>
+      </w:rPr>
+    </w:lvl>
+    <w:lvl w:ilvl="8" w:tplc="240A0005" w:tentative="1">
+      <w:start w:val="1"/>
+      <w:numFmt w:val="bullet"/>
+      <w:lvlText w:val=""/>
+      <w:lvlJc w:val="left"/>
+      <w:pPr>
+        <w:ind w:left="6480" w:hanging="360"/>
+      </w:pPr>
+      <w:rPr>
+        <w:rFonts w:ascii="Wingdings" w:hAnsi="Wingdings" w:hint="default"/>
+      </w:rPr>
+    </w:lvl>
+  </w:abstractNum>
+  <w:abstractNum w:abstractNumId="1" w15:restartNumberingAfterBreak="0">
+    <w:nsid w:val="3BB6766B"/>
+    <w:multiLevelType w:val="hybridMultilevel"/>
+    <w:tmpl w:val="7994B090"/>
+    <w:lvl w:ilvl="0" w:tplc="240A0001">
+      <w:start w:val="1"/>
+      <w:numFmt w:val="bullet"/>
+      <w:lvlText w:val=""/>
+      <w:lvlJc w:val="left"/>
+      <w:pPr>
+        <w:ind w:left="720" w:hanging="360"/>
+      </w:pPr>
+      <w:rPr>
+        <w:rFonts w:ascii="Symbol" w:hAnsi="Symbol" w:hint="default"/>
+      </w:rPr>
+    </w:lvl>
+    <w:lvl w:ilvl="1" w:tplc="240A0003" w:tentative="1">
+      <w:start w:val="1"/>
+      <w:numFmt w:val="bullet"/>
+      <w:lvlText w:val="o"/>
+      <w:lvlJc w:val="left"/>
+      <w:pPr>
+        <w:ind w:left="1440" w:hanging="360"/>
+      </w:pPr>
+      <w:rPr>
+        <w:rFonts w:ascii="Courier New" w:hAnsi="Courier New" w:cs="Courier New" w:hint="default"/>
+      </w:rPr>
+    </w:lvl>
+    <w:lvl w:ilvl="2" w:tplc="240A0005" w:tentative="1">
+      <w:start w:val="1"/>
+      <w:numFmt w:val="bullet"/>
+      <w:lvlText w:val=""/>
+      <w:lvlJc w:val="left"/>
+      <w:pPr>
+        <w:ind w:left="2160" w:hanging="360"/>
+      </w:pPr>
+      <w:rPr>
+        <w:rFonts w:ascii="Wingdings" w:hAnsi="Wingdings" w:hint="default"/>
+      </w:rPr>
+    </w:lvl>
+    <w:lvl w:ilvl="3" w:tplc="240A0001" w:tentative="1">
+      <w:start w:val="1"/>
+      <w:numFmt w:val="bullet"/>
+      <w:lvlText w:val=""/>
+      <w:lvlJc w:val="left"/>
+      <w:pPr>
+        <w:ind w:left="2880" w:hanging="360"/>
+      </w:pPr>
+      <w:rPr>
+        <w:rFonts w:ascii="Symbol" w:hAnsi="Symbol" w:hint="default"/>
+      </w:rPr>
+    </w:lvl>
+    <w:lvl w:ilvl="4" w:tplc="240A0003" w:tentative="1">
+      <w:start w:val="1"/>
+      <w:numFmt w:val="bullet"/>
+      <w:lvlText w:val="o"/>
+      <w:lvlJc w:val="left"/>
+      <w:pPr>
+        <w:ind w:left="3600" w:hanging="360"/>
+      </w:pPr>
+      <w:rPr>
+        <w:rFonts w:ascii="Courier New" w:hAnsi="Courier New" w:cs="Courier New" w:hint="default"/>
+      </w:rPr>
+    </w:lvl>
+    <w:lvl w:ilvl="5" w:tplc="240A0005" w:tentative="1">
+      <w:start w:val="1"/>
+      <w:numFmt w:val="bullet"/>
+      <w:lvlText w:val=""/>
+      <w:lvlJc w:val="left"/>
+      <w:pPr>
+        <w:ind w:left="4320" w:hanging="360"/>
+      </w:pPr>
+      <w:rPr>
+        <w:rFonts w:ascii="Wingdings" w:hAnsi="Wingdings" w:hint="default"/>
+      </w:rPr>
+    </w:lvl>
+    <w:lvl w:ilvl="6" w:tplc="240A0001" w:tentative="1">
+      <w:start w:val="1"/>
+      <w:numFmt w:val="bullet"/>
+      <w:lvlText w:val=""/>
+      <w:lvlJc w:val="left"/>
+      <w:pPr>
+        <w:ind w:left="5040" w:hanging="360"/>
+      </w:pPr>
+      <w:rPr>
+        <w:rFonts w:ascii="Symbol" w:hAnsi="Symbol" w:hint="default"/>
+      </w:rPr>
+    </w:lvl>
+    <w:lvl w:ilvl="7" w:tplc="240A0003" w:tentative="1">
+      <w:start w:val="1"/>
+      <w:numFmt w:val="bullet"/>
+      <w:lvlText w:val="o"/>
+      <w:lvlJc w:val="left"/>
+      <w:pPr>
+        <w:ind w:left="5760" w:hanging="360"/>
+      </w:pPr>
+      <w:rPr>
+        <w:rFonts w:ascii="Courier New" w:hAnsi="Courier New" w:cs="Courier New" w:hint="default"/>
+      </w:rPr>
+    </w:lvl>
+    <w:lvl w:ilvl="8" w:tplc="240A0005" w:tentative="1">
+      <w:start w:val="1"/>
+      <w:numFmt w:val="bullet"/>
+      <w:lvlText w:val=""/>
+      <w:lvlJc w:val="left"/>
+      <w:pPr>
+        <w:ind w:left="6480" w:hanging="360"/>
+      </w:pPr>
+      <w:rPr>
+        <w:rFonts w:ascii="Wingdings" w:hAnsi="Wingdings" w:hint="default"/>
+      </w:rPr>
+    </w:lvl>
+  </w:abstractNum>
+  <w:num w:numId="1" w16cid:durableId="1646814806">
+    <w:abstractNumId w:val="1"/>
+  </w:num>
+  <w:num w:numId="2" w16cid:durableId="1715348171">
+    <w:abstractNumId w:val="0"/>
+  </w:num>
+</w:numbering>
+</file>
+
 <file path=word/styles.xml><?xml version="1.0" encoding="utf-8"?>
-<w:styles xmlns:mc="http://schemas.openxmlformats.org/markup-compatibility/2006" xmlns:r="http://schemas.openxmlformats.org/officeDocument/2006/relationships" xmlns:w="http://schemas.openxmlformats.org/wordprocessingml/2006/main" xmlns:w14="http://schemas.microsoft.com/office/word/2010/wordml" xmlns:w15="http://schemas.microsoft.com/office/word/2012/wordml" xmlns:w16se="http://schemas.microsoft.com/office/word/2015/wordml/symex" mc:Ignorable="w14 w15 w16se">
+<w:styles xmlns:mc="http://schemas.openxmlformats.org/markup-compatibility/2006" xmlns:r="http://schemas.openxmlformats.org/officeDocument/2006/relationships" xmlns:w="http://schemas.openxmlformats.org/wordprocessingml/2006/main" xmlns:w14="http://schemas.microsoft.com/office/word/2010/wordml" xmlns:w15="http://schemas.microsoft.com/office/word/2012/wordml" xmlns:w16cex="http://schemas.microsoft.com/office/word/2018/wordml/cex" xmlns:w16cid="http://schemas.microsoft.com/office/word/2016/wordml/cid" xmlns:w16="http://schemas.microsoft.com/office/word/2018/wordml" xmlns:w16du="http://schemas.microsoft.com/office/word/2023/wordml/word16du" xmlns:w16sdtdh="http://schemas.microsoft.com/office/word/2020/wordml/sdtdatahash" xmlns:w16sdtfl="http://schemas.microsoft.com/office/word/2024/wordml/sdtformatlock" xmlns:w16se="http://schemas.microsoft.com/office/word/2015/wordml/symex" mc:Ignorable="w14 w15 w16se w16cid w16 w16cex w16sdtdh w16sdtfl w16du">
   <w:docDefaults>
     <w:rPrDefault>
       <w:rPr>
@@ -190,7 +1596,7 @@
       </w:pPr>
     </w:pPrDefault>
   </w:docDefaults>
-  <w:latentStyles w:defLockedState="0" w:defUIPriority="99" w:defSemiHidden="0" w:defUnhideWhenUsed="0" w:defQFormat="0" w:count="371">
+  <w:latentStyles w:defLockedState="0" w:defUIPriority="99" w:defSemiHidden="0" w:defUnhideWhenUsed="0" w:defQFormat="0" w:count="376">
     <w:lsdException w:name="Normal" w:uiPriority="0" w:qFormat="1"/>
     <w:lsdException w:name="heading 1" w:uiPriority="9" w:qFormat="1"/>
     <w:lsdException w:name="heading 2" w:semiHidden="1" w:uiPriority="9" w:unhideWhenUsed="1" w:qFormat="1"/>
@@ -562,6 +1968,11 @@
     <w:lsdException w:name="List Table 5 Dark Accent 6" w:uiPriority="50"/>
     <w:lsdException w:name="List Table 6 Colorful Accent 6" w:uiPriority="51"/>
     <w:lsdException w:name="List Table 7 Colorful Accent 6" w:uiPriority="52"/>
+    <w:lsdException w:name="Mention" w:semiHidden="1" w:unhideWhenUsed="1"/>
+    <w:lsdException w:name="Smart Hyperlink" w:semiHidden="1" w:unhideWhenUsed="1"/>
+    <w:lsdException w:name="Hashtag" w:semiHidden="1" w:unhideWhenUsed="1"/>
+    <w:lsdException w:name="Unresolved Mention" w:semiHidden="1" w:unhideWhenUsed="1"/>
+    <w:lsdException w:name="Smart Link" w:semiHidden="1" w:unhideWhenUsed="1"/>
   </w:latentStyles>
   <w:style w:type="paragraph" w:default="1" w:styleId="Normal">
     <w:name w:val="Normal"/>
@@ -593,6 +2004,17 @@
     <w:uiPriority w:val="99"/>
     <w:semiHidden/>
     <w:unhideWhenUsed/>
+  </w:style>
+  <w:style w:type="paragraph" w:styleId="Prrafodelista">
+    <w:name w:val="List Paragraph"/>
+    <w:basedOn w:val="Normal"/>
+    <w:uiPriority w:val="34"/>
+    <w:qFormat/>
+    <w:rsid w:val="00B10CC0"/>
+    <w:pPr>
+      <w:ind w:left="720"/>
+      <w:contextualSpacing/>
+    </w:pPr>
   </w:style>
 </w:styles>
 </file>

</xml_diff>

<commit_message>
añadi los metodos en el documento
</commit_message>
<xml_diff>
--- a/AVANCE.docx
+++ b/AVANCE.docx
@@ -900,6 +900,7 @@
         <w:rPr>
           <w:rFonts w:ascii="Arial" w:hAnsi="Arial" w:cs="Arial"/>
           <w:bCs/>
+          <w:noProof/>
           <w:sz w:val="24"/>
           <w:szCs w:val="24"/>
         </w:rPr>
@@ -1026,6 +1027,7 @@
         <w:rPr>
           <w:rFonts w:ascii="Arial" w:hAnsi="Arial" w:cs="Arial"/>
           <w:bCs/>
+          <w:noProof/>
           <w:sz w:val="24"/>
           <w:szCs w:val="24"/>
         </w:rPr>
@@ -1080,6 +1082,7 @@
         <w:rPr>
           <w:rFonts w:ascii="Arial" w:hAnsi="Arial" w:cs="Arial"/>
           <w:bCs/>
+          <w:noProof/>
           <w:sz w:val="24"/>
           <w:szCs w:val="24"/>
         </w:rPr>
@@ -1124,6 +1127,7 @@
         <w:rPr>
           <w:rFonts w:ascii="Arial" w:hAnsi="Arial" w:cs="Arial"/>
           <w:bCs/>
+          <w:noProof/>
           <w:sz w:val="24"/>
           <w:szCs w:val="24"/>
         </w:rPr>
@@ -1295,6 +1299,27 @@
           <w:sz w:val="24"/>
           <w:szCs w:val="24"/>
         </w:rPr>
+        <w:t>CAPSULA:</w:t>
+      </w:r>
+    </w:p>
+    <w:p>
+      <w:pPr>
+        <w:jc w:val="both"/>
+        <w:rPr>
+          <w:rFonts w:ascii="Arial" w:hAnsi="Arial" w:cs="Arial"/>
+          <w:bCs/>
+          <w:sz w:val="24"/>
+          <w:szCs w:val="24"/>
+        </w:rPr>
+      </w:pPr>
+      <w:r>
+        <w:rPr>
+          <w:rFonts w:ascii="Arial" w:hAnsi="Arial" w:cs="Arial"/>
+          <w:bCs/>
+          <w:noProof/>
+          <w:sz w:val="24"/>
+          <w:szCs w:val="24"/>
+        </w:rPr>
         <w:drawing>
           <wp:inline distT="0" distB="0" distL="0" distR="0" wp14:anchorId="1C48E4A7" wp14:editId="7E7542E1">
             <wp:extent cx="5612130" cy="1603375"/>
@@ -1320,6 +1345,413 @@
                     <a:xfrm>
                       <a:off x="0" y="0"/>
                       <a:ext cx="5612130" cy="1603375"/>
+                    </a:xfrm>
+                    <a:prstGeom prst="rect">
+                      <a:avLst/>
+                    </a:prstGeom>
+                  </pic:spPr>
+                </pic:pic>
+              </a:graphicData>
+            </a:graphic>
+          </wp:inline>
+        </w:drawing>
+      </w:r>
+    </w:p>
+    <w:p>
+      <w:pPr>
+        <w:jc w:val="both"/>
+        <w:rPr>
+          <w:rFonts w:ascii="Arial" w:hAnsi="Arial" w:cs="Arial"/>
+          <w:bCs/>
+          <w:sz w:val="24"/>
+          <w:szCs w:val="24"/>
+        </w:rPr>
+      </w:pPr>
+      <w:r>
+        <w:rPr>
+          <w:rFonts w:ascii="Arial" w:hAnsi="Arial" w:cs="Arial"/>
+          <w:bCs/>
+          <w:sz w:val="24"/>
+          <w:szCs w:val="24"/>
+        </w:rPr>
+        <w:t>SHIP:</w:t>
+      </w:r>
+    </w:p>
+    <w:p>
+      <w:pPr>
+        <w:jc w:val="both"/>
+        <w:rPr>
+          <w:rFonts w:ascii="Arial" w:hAnsi="Arial" w:cs="Arial"/>
+          <w:bCs/>
+          <w:sz w:val="24"/>
+          <w:szCs w:val="24"/>
+        </w:rPr>
+      </w:pPr>
+      <w:r>
+        <w:rPr>
+          <w:rFonts w:ascii="Arial" w:hAnsi="Arial" w:cs="Arial"/>
+          <w:bCs/>
+          <w:sz w:val="24"/>
+          <w:szCs w:val="24"/>
+        </w:rPr>
+        <w:drawing>
+          <wp:inline distT="0" distB="0" distL="0" distR="0" wp14:anchorId="7710DD6F" wp14:editId="4FAAD1DC">
+            <wp:extent cx="5612130" cy="1645285"/>
+            <wp:effectExtent l="0" t="0" r="7620" b="0"/>
+            <wp:docPr id="231063084" name="Imagen 1"/>
+            <wp:cNvGraphicFramePr>
+              <a:graphicFrameLocks xmlns:a="http://schemas.openxmlformats.org/drawingml/2006/main" noChangeAspect="1"/>
+            </wp:cNvGraphicFramePr>
+            <a:graphic xmlns:a="http://schemas.openxmlformats.org/drawingml/2006/main">
+              <a:graphicData uri="http://schemas.openxmlformats.org/drawingml/2006/picture">
+                <pic:pic xmlns:pic="http://schemas.openxmlformats.org/drawingml/2006/picture">
+                  <pic:nvPicPr>
+                    <pic:cNvPr id="231063084" name=""/>
+                    <pic:cNvPicPr/>
+                  </pic:nvPicPr>
+                  <pic:blipFill>
+                    <a:blip r:embed="rId11"/>
+                    <a:stretch>
+                      <a:fillRect/>
+                    </a:stretch>
+                  </pic:blipFill>
+                  <pic:spPr>
+                    <a:xfrm>
+                      <a:off x="0" y="0"/>
+                      <a:ext cx="5612130" cy="1645285"/>
+                    </a:xfrm>
+                    <a:prstGeom prst="rect">
+                      <a:avLst/>
+                    </a:prstGeom>
+                  </pic:spPr>
+                </pic:pic>
+              </a:graphicData>
+            </a:graphic>
+          </wp:inline>
+        </w:drawing>
+      </w:r>
+    </w:p>
+    <w:p>
+      <w:pPr>
+        <w:jc w:val="both"/>
+        <w:rPr>
+          <w:rFonts w:ascii="Arial" w:hAnsi="Arial" w:cs="Arial"/>
+          <w:bCs/>
+          <w:sz w:val="24"/>
+          <w:szCs w:val="24"/>
+        </w:rPr>
+      </w:pPr>
+      <w:r>
+        <w:rPr>
+          <w:rFonts w:ascii="Arial" w:hAnsi="Arial" w:cs="Arial"/>
+          <w:bCs/>
+          <w:sz w:val="24"/>
+          <w:szCs w:val="24"/>
+        </w:rPr>
+        <w:t>SAILOR:</w:t>
+      </w:r>
+    </w:p>
+    <w:p>
+      <w:pPr>
+        <w:jc w:val="both"/>
+        <w:rPr>
+          <w:rFonts w:ascii="Arial" w:hAnsi="Arial" w:cs="Arial"/>
+          <w:bCs/>
+          <w:sz w:val="24"/>
+          <w:szCs w:val="24"/>
+        </w:rPr>
+      </w:pPr>
+      <w:r>
+        <w:rPr>
+          <w:rFonts w:ascii="Arial" w:hAnsi="Arial" w:cs="Arial"/>
+          <w:bCs/>
+          <w:sz w:val="24"/>
+          <w:szCs w:val="24"/>
+        </w:rPr>
+        <w:drawing>
+          <wp:inline distT="0" distB="0" distL="0" distR="0" wp14:anchorId="0F399955" wp14:editId="5A557020">
+            <wp:extent cx="5612130" cy="918210"/>
+            <wp:effectExtent l="0" t="0" r="7620" b="0"/>
+            <wp:docPr id="1635432538" name="Imagen 1"/>
+            <wp:cNvGraphicFramePr>
+              <a:graphicFrameLocks xmlns:a="http://schemas.openxmlformats.org/drawingml/2006/main" noChangeAspect="1"/>
+            </wp:cNvGraphicFramePr>
+            <a:graphic xmlns:a="http://schemas.openxmlformats.org/drawingml/2006/main">
+              <a:graphicData uri="http://schemas.openxmlformats.org/drawingml/2006/picture">
+                <pic:pic xmlns:pic="http://schemas.openxmlformats.org/drawingml/2006/picture">
+                  <pic:nvPicPr>
+                    <pic:cNvPr id="1635432538" name=""/>
+                    <pic:cNvPicPr/>
+                  </pic:nvPicPr>
+                  <pic:blipFill>
+                    <a:blip r:embed="rId12"/>
+                    <a:stretch>
+                      <a:fillRect/>
+                    </a:stretch>
+                  </pic:blipFill>
+                  <pic:spPr>
+                    <a:xfrm>
+                      <a:off x="0" y="0"/>
+                      <a:ext cx="5612130" cy="918210"/>
+                    </a:xfrm>
+                    <a:prstGeom prst="rect">
+                      <a:avLst/>
+                    </a:prstGeom>
+                  </pic:spPr>
+                </pic:pic>
+              </a:graphicData>
+            </a:graphic>
+          </wp:inline>
+        </w:drawing>
+      </w:r>
+    </w:p>
+    <w:p>
+      <w:pPr>
+        <w:jc w:val="both"/>
+        <w:rPr>
+          <w:rFonts w:ascii="Arial" w:hAnsi="Arial" w:cs="Arial"/>
+          <w:bCs/>
+          <w:sz w:val="24"/>
+          <w:szCs w:val="24"/>
+        </w:rPr>
+      </w:pPr>
+    </w:p>
+    <w:p>
+      <w:pPr>
+        <w:jc w:val="both"/>
+        <w:rPr>
+          <w:rFonts w:ascii="Arial" w:hAnsi="Arial" w:cs="Arial"/>
+          <w:bCs/>
+          <w:sz w:val="24"/>
+          <w:szCs w:val="24"/>
+        </w:rPr>
+      </w:pPr>
+    </w:p>
+    <w:p>
+      <w:pPr>
+        <w:jc w:val="both"/>
+        <w:rPr>
+          <w:rFonts w:ascii="Arial" w:hAnsi="Arial" w:cs="Arial"/>
+          <w:bCs/>
+          <w:sz w:val="24"/>
+          <w:szCs w:val="24"/>
+        </w:rPr>
+      </w:pPr>
+    </w:p>
+    <w:p>
+      <w:pPr>
+        <w:jc w:val="both"/>
+        <w:rPr>
+          <w:rFonts w:ascii="Arial" w:hAnsi="Arial" w:cs="Arial"/>
+          <w:bCs/>
+          <w:sz w:val="24"/>
+          <w:szCs w:val="24"/>
+        </w:rPr>
+      </w:pPr>
+    </w:p>
+    <w:p>
+      <w:pPr>
+        <w:jc w:val="both"/>
+        <w:rPr>
+          <w:rFonts w:ascii="Arial" w:hAnsi="Arial" w:cs="Arial"/>
+          <w:bCs/>
+          <w:sz w:val="24"/>
+          <w:szCs w:val="24"/>
+        </w:rPr>
+      </w:pPr>
+      <w:r>
+        <w:rPr>
+          <w:rFonts w:ascii="Arial" w:hAnsi="Arial" w:cs="Arial"/>
+          <w:bCs/>
+          <w:sz w:val="24"/>
+          <w:szCs w:val="24"/>
+        </w:rPr>
+        <w:lastRenderedPageBreak/>
+        <w:t xml:space="preserve">Este </w:t>
+      </w:r>
+      <w:proofErr w:type="spellStart"/>
+      <w:r>
+        <w:rPr>
+          <w:rFonts w:ascii="Arial" w:hAnsi="Arial" w:cs="Arial"/>
+          <w:bCs/>
+          <w:sz w:val="24"/>
+          <w:szCs w:val="24"/>
+        </w:rPr>
+        <w:t>seria</w:t>
+      </w:r>
+      <w:proofErr w:type="spellEnd"/>
+      <w:r>
+        <w:rPr>
+          <w:rFonts w:ascii="Arial" w:hAnsi="Arial" w:cs="Arial"/>
+          <w:bCs/>
+          <w:sz w:val="24"/>
+          <w:szCs w:val="24"/>
+        </w:rPr>
+        <w:t xml:space="preserve"> el código de cada método de autodestrucción, el del </w:t>
+      </w:r>
+      <w:proofErr w:type="spellStart"/>
+      <w:r>
+        <w:rPr>
+          <w:rFonts w:ascii="Arial" w:hAnsi="Arial" w:cs="Arial"/>
+          <w:bCs/>
+          <w:sz w:val="24"/>
+          <w:szCs w:val="24"/>
+        </w:rPr>
+        <w:t>sailor</w:t>
+      </w:r>
+      <w:proofErr w:type="spellEnd"/>
+      <w:r>
+        <w:rPr>
+          <w:rFonts w:ascii="Arial" w:hAnsi="Arial" w:cs="Arial"/>
+          <w:bCs/>
+          <w:sz w:val="24"/>
+          <w:szCs w:val="24"/>
+        </w:rPr>
+        <w:t xml:space="preserve"> no incluye el “</w:t>
+      </w:r>
+      <w:proofErr w:type="spellStart"/>
+      <w:r>
+        <w:rPr>
+          <w:rFonts w:ascii="Arial" w:hAnsi="Arial" w:cs="Arial"/>
+          <w:bCs/>
+          <w:sz w:val="24"/>
+          <w:szCs w:val="24"/>
+        </w:rPr>
+        <w:t>for</w:t>
+      </w:r>
+      <w:proofErr w:type="spellEnd"/>
+      <w:r>
+        <w:rPr>
+          <w:rFonts w:ascii="Arial" w:hAnsi="Arial" w:cs="Arial"/>
+          <w:bCs/>
+          <w:sz w:val="24"/>
+          <w:szCs w:val="24"/>
+        </w:rPr>
+        <w:t xml:space="preserve">” por lo que este no tiene una responsabilidad como las nodrizas, también para que la flota llevara el conocimiento de las maquinas que se han destruido añadimos un atributo tipo </w:t>
+      </w:r>
+      <w:proofErr w:type="spellStart"/>
+      <w:r>
+        <w:rPr>
+          <w:rFonts w:ascii="Arial" w:hAnsi="Arial" w:cs="Arial"/>
+          <w:bCs/>
+          <w:sz w:val="24"/>
+          <w:szCs w:val="24"/>
+        </w:rPr>
+        <w:t>ArrayList</w:t>
+      </w:r>
+      <w:proofErr w:type="spellEnd"/>
+      <w:r>
+        <w:rPr>
+          <w:rFonts w:ascii="Arial" w:hAnsi="Arial" w:cs="Arial"/>
+          <w:bCs/>
+          <w:sz w:val="24"/>
+          <w:szCs w:val="24"/>
+        </w:rPr>
+        <w:t xml:space="preserve"> en el método llamado </w:t>
+      </w:r>
+      <w:proofErr w:type="spellStart"/>
+      <w:r>
+        <w:rPr>
+          <w:rFonts w:ascii="Arial" w:hAnsi="Arial" w:cs="Arial"/>
+          <w:bCs/>
+          <w:sz w:val="24"/>
+          <w:szCs w:val="24"/>
+        </w:rPr>
+        <w:t>destroyedMachines</w:t>
+      </w:r>
+      <w:proofErr w:type="spellEnd"/>
+      <w:r>
+        <w:rPr>
+          <w:rFonts w:ascii="Arial" w:hAnsi="Arial" w:cs="Arial"/>
+          <w:bCs/>
+          <w:sz w:val="24"/>
+          <w:szCs w:val="24"/>
+        </w:rPr>
+        <w:t xml:space="preserve">(), este atributo nos devuelve la lista de todas las </w:t>
+      </w:r>
+      <w:proofErr w:type="spellStart"/>
+      <w:r>
+        <w:rPr>
+          <w:rFonts w:ascii="Arial" w:hAnsi="Arial" w:cs="Arial"/>
+          <w:bCs/>
+          <w:sz w:val="24"/>
+          <w:szCs w:val="24"/>
+        </w:rPr>
+        <w:t>maquinas</w:t>
+      </w:r>
+      <w:proofErr w:type="spellEnd"/>
+      <w:r>
+        <w:rPr>
+          <w:rFonts w:ascii="Arial" w:hAnsi="Arial" w:cs="Arial"/>
+          <w:bCs/>
+          <w:sz w:val="24"/>
+          <w:szCs w:val="24"/>
+        </w:rPr>
+        <w:t xml:space="preserve"> y </w:t>
+      </w:r>
+      <w:proofErr w:type="spellStart"/>
+      <w:r>
+        <w:rPr>
+          <w:rFonts w:ascii="Arial" w:hAnsi="Arial" w:cs="Arial"/>
+          <w:bCs/>
+          <w:sz w:val="24"/>
+          <w:szCs w:val="24"/>
+        </w:rPr>
+        <w:t>sailors</w:t>
+      </w:r>
+      <w:proofErr w:type="spellEnd"/>
+      <w:r>
+        <w:rPr>
+          <w:rFonts w:ascii="Arial" w:hAnsi="Arial" w:cs="Arial"/>
+          <w:bCs/>
+          <w:sz w:val="24"/>
+          <w:szCs w:val="24"/>
+        </w:rPr>
+        <w:t xml:space="preserve"> que han sido destruidos.</w:t>
+      </w:r>
+    </w:p>
+    <w:p>
+      <w:pPr>
+        <w:jc w:val="both"/>
+        <w:rPr>
+          <w:rFonts w:ascii="Arial" w:hAnsi="Arial" w:cs="Arial"/>
+          <w:bCs/>
+          <w:sz w:val="24"/>
+          <w:szCs w:val="24"/>
+        </w:rPr>
+      </w:pPr>
+      <w:r>
+        <w:rPr>
+          <w:rFonts w:ascii="Arial" w:hAnsi="Arial" w:cs="Arial"/>
+          <w:bCs/>
+          <w:sz w:val="24"/>
+          <w:szCs w:val="24"/>
+        </w:rPr>
+        <w:drawing>
+          <wp:inline distT="0" distB="0" distL="0" distR="0" wp14:anchorId="33348FE2" wp14:editId="041B2362">
+            <wp:extent cx="5612130" cy="2611755"/>
+            <wp:effectExtent l="0" t="0" r="7620" b="0"/>
+            <wp:docPr id="918730781" name="Imagen 1"/>
+            <wp:cNvGraphicFramePr>
+              <a:graphicFrameLocks xmlns:a="http://schemas.openxmlformats.org/drawingml/2006/main" noChangeAspect="1"/>
+            </wp:cNvGraphicFramePr>
+            <a:graphic xmlns:a="http://schemas.openxmlformats.org/drawingml/2006/main">
+              <a:graphicData uri="http://schemas.openxmlformats.org/drawingml/2006/picture">
+                <pic:pic xmlns:pic="http://schemas.openxmlformats.org/drawingml/2006/picture">
+                  <pic:nvPicPr>
+                    <pic:cNvPr id="918730781" name=""/>
+                    <pic:cNvPicPr/>
+                  </pic:nvPicPr>
+                  <pic:blipFill>
+                    <a:blip r:embed="rId13"/>
+                    <a:stretch>
+                      <a:fillRect/>
+                    </a:stretch>
+                  </pic:blipFill>
+                  <pic:spPr>
+                    <a:xfrm>
+                      <a:off x="0" y="0"/>
+                      <a:ext cx="5612130" cy="2611755"/>
                     </a:xfrm>
                     <a:prstGeom prst="rect">
                       <a:avLst/>

</xml_diff>